<commit_message>
introduire le but de l'etude
</commit_message>
<xml_diff>
--- a/docs/ODD document MC-AB-SFC2.docx
+++ b/docs/ODD document MC-AB-SFC2.docx
@@ -87,14 +87,456 @@
     <w:p>
       <w:pPr>
         <w:pStyle w:val="Titre1"/>
-      </w:pPr>
+        <w:rPr>
+          <w:lang w:val="en-US"/>
+        </w:rPr>
+      </w:pPr>
+      <w:r>
+        <w:rPr>
+          <w:lang w:val="en-US"/>
+        </w:rPr>
+        <w:t>Purpose and Patterns</w:t>
+      </w:r>
+    </w:p>
+    <w:p>
+      <w:pPr>
+        <w:pStyle w:val="Titre2"/>
+      </w:pPr>
+      <w:r>
+        <w:t xml:space="preserve">Model </w:t>
+      </w:r>
+      <w:r>
+        <w:t>Purpose</w:t>
+      </w:r>
+    </w:p>
+    <w:p>
+      <w:pPr>
+        <w:rPr>
+          <w:lang w:val="en-US"/>
+        </w:rPr>
+      </w:pPr>
+      <w:r>
+        <w:rPr>
+          <w:lang w:val="en-US"/>
+        </w:rPr>
+        <w:t>The purpose of the</w:t>
+      </w:r>
+      <w:r>
+        <w:rPr>
+          <w:lang w:val="en-US"/>
+        </w:rPr>
+        <w:t xml:space="preserve"> Multi-Country </w:t>
+      </w:r>
+      <w:r>
+        <w:rPr>
+          <w:lang w:val="en-US"/>
+        </w:rPr>
+        <w:t>Agent-Based Stock-Flow Consistent (</w:t>
+      </w:r>
+      <w:r>
+        <w:rPr>
+          <w:lang w:val="en-US"/>
+        </w:rPr>
+        <w:t>MC-</w:t>
+      </w:r>
+      <w:r>
+        <w:rPr>
+          <w:lang w:val="en-US"/>
+        </w:rPr>
+        <w:t xml:space="preserve">AB-SFC) </w:t>
+      </w:r>
+      <w:r>
+        <w:rPr>
+          <w:lang w:val="en-US"/>
+        </w:rPr>
+        <w:t xml:space="preserve">model </w:t>
+      </w:r>
+      <w:r>
+        <w:rPr>
+          <w:lang w:val="en-US"/>
+        </w:rPr>
+        <w:t>is to</w:t>
+      </w:r>
+      <w:r>
+        <w:rPr>
+          <w:lang w:val="en-US"/>
+        </w:rPr>
+        <w:t xml:space="preserve"> </w:t>
+      </w:r>
+      <w:r>
+        <w:rPr>
+          <w:lang w:val="en-US"/>
+        </w:rPr>
+        <w:t>analyze the impact of different fiscal regimes on the long-term economic dynamics of a Monetary Union broadly comparable to the European Economic and Monetary Union (EMU)</w:t>
+      </w:r>
+      <w:r>
+        <w:rPr>
+          <w:lang w:val="en-US"/>
+        </w:rPr>
+        <w:t xml:space="preserve"> </w:t>
+      </w:r>
+      <w:r>
+        <w:rPr>
+          <w:lang w:val="en-US"/>
+        </w:rPr>
+        <w:fldChar w:fldCharType="begin"/>
+      </w:r>
+      <w:r>
+        <w:rPr>
+          <w:lang w:val="en-US"/>
+        </w:rPr>
+        <w:instrText xml:space="preserve"> ADDIN ZOTERO_ITEM CSL_CITATION {"citationID":"DmUeP9Zr","properties":{"unsorted":false,"formattedCitation":"(Caiani et al., 2018)","plainCitation":"(Caiani et al., 2018)","noteIndex":0},"citationItems":[{"id":2990,"uris":["http://zotero.org/users/6933183/items/JWN6F86P"],"itemData":{"id":2990,"type":"article-journal","abstract":"We present an Agent Based-Stock Flow Consistent Multi-Country model of a Monetary Union to analyze the impact of a change in the ﬁscal regime of member countries, modeled as a permanent change in the deﬁcit-to-gross domestic product (GDP) target that governments are committed to comply. Simulations are performed under three scenarios, differentiated by the number of countries considered (2, 6, 10). The parametric conﬁguration employed yields economically reasonable values for the dynamics and relative dimension of key variables, broadly comparable with historical data and available stylized facts. Our policy experiments show that ﬁscal expansions generally allow to improve the dynamics of real GDP, labor productivity, and employment, though being generally associated with higher levels of public debt. Conversely, permanent ﬁscal contractions always exert strong recessionary effects, exacerbate real GDP volatility, and tend to be self-defeating in the long run. In scenarios where the Monetary Union includes a greater number of countries and the common market is bigger, ﬁscal austerity raises—rather than decreasing—average public debt-to-GDP ratios. We show that this is mainly related to a raise of debt-toGDP in poorer and less productive countries mirrored by a reduction of their net foreign asset position.","container-title":"Industrial and Corporate Change","DOI":"10.1093/icc/dty016","ISSN":"0960-6491, 1464-3650","language":"en","source":"DOI.org (Crossref)","title":"The effects of fiscal targets in a monetary union: a Multi-Country Agent-Based Stock Flow Consistent model","title-short":"The effects of fiscal targets in a monetary union","URL":"https://academic.oup.com/icc/advance-article/doi/10.1093/icc/dty016/4964718","author":[{"family":"Caiani","given":"Alessandro"},{"family":"Catullo","given":"Ermanno"},{"family":"Gallegati","given":"Mauro"}],"accessed":{"date-parts":[["2021",5,8]]},"issued":{"date-parts":[["2018",4,7]]}}}],"schema":"https://github.com/citation-style-language/schema/raw/master/csl-citation.json"} </w:instrText>
+      </w:r>
+      <w:r>
+        <w:rPr>
+          <w:lang w:val="en-US"/>
+        </w:rPr>
+        <w:fldChar w:fldCharType="separate"/>
+      </w:r>
+      <w:r>
+        <w:rPr>
+          <w:rFonts w:cs="Times New Roman"/>
+          <w:lang w:val="en-US"/>
+        </w:rPr>
+        <w:t>(</w:t>
+      </w:r>
       <w:proofErr w:type="spellStart"/>
       <w:r>
-        <w:t>Purpose</w:t>
+        <w:rPr>
+          <w:rFonts w:cs="Times New Roman"/>
+          <w:lang w:val="en-US"/>
+        </w:rPr>
+        <w:t>Caiani</w:t>
       </w:r>
       <w:proofErr w:type="spellEnd"/>
       <w:r>
-        <w:t xml:space="preserve"> and Patterns</w:t>
+        <w:rPr>
+          <w:rFonts w:cs="Times New Roman"/>
+          <w:lang w:val="en-US"/>
+        </w:rPr>
+        <w:t xml:space="preserve"> et al., 2018)</w:t>
+      </w:r>
+      <w:r>
+        <w:rPr>
+          <w:lang w:val="en-US"/>
+        </w:rPr>
+        <w:fldChar w:fldCharType="end"/>
+      </w:r>
+      <w:r>
+        <w:rPr>
+          <w:lang w:val="en-US"/>
+        </w:rPr>
+        <w:t>.</w:t>
+      </w:r>
+    </w:p>
+    <w:p>
+      <w:pPr>
+        <w:pStyle w:val="Titre2"/>
+      </w:pPr>
+      <w:r>
+        <w:t>Replication Purpose</w:t>
+      </w:r>
+    </w:p>
+    <w:p>
+      <w:pPr>
+        <w:rPr>
+          <w:lang w:val="en-US"/>
+        </w:rPr>
+      </w:pPr>
+      <w:r>
+        <w:rPr>
+          <w:lang w:val="en-US"/>
+        </w:rPr>
+        <w:t xml:space="preserve">The purpose of this work is to replicate the core mechanisms of the </w:t>
+      </w:r>
+      <w:r>
+        <w:rPr>
+          <w:lang w:val="en-US"/>
+        </w:rPr>
+        <w:t>MC-</w:t>
+      </w:r>
+      <w:r>
+        <w:rPr>
+          <w:lang w:val="en-US"/>
+        </w:rPr>
+        <w:t xml:space="preserve">AB-SFC model developed by </w:t>
+      </w:r>
+      <w:proofErr w:type="spellStart"/>
+      <w:r>
+        <w:rPr>
+          <w:lang w:val="en-US"/>
+        </w:rPr>
+        <w:t>Caiani</w:t>
+      </w:r>
+      <w:proofErr w:type="spellEnd"/>
+      <w:r>
+        <w:rPr>
+          <w:lang w:val="en-US"/>
+        </w:rPr>
+        <w:t xml:space="preserve"> et al.</w:t>
+      </w:r>
+      <w:r>
+        <w:rPr>
+          <w:lang w:val="en-US"/>
+        </w:rPr>
+        <w:t xml:space="preserve"> </w:t>
+      </w:r>
+      <w:r>
+        <w:rPr>
+          <w:lang w:val="en-US"/>
+        </w:rPr>
+        <w:fldChar w:fldCharType="begin"/>
+      </w:r>
+      <w:r>
+        <w:rPr>
+          <w:lang w:val="en-US"/>
+        </w:rPr>
+        <w:instrText xml:space="preserve"> ADDIN ZOTERO_ITEM CSL_CITATION {"citationID":"Yjol5AmN","properties":{"unsorted":false,"formattedCitation":"(2018)","plainCitation":"(2018)","noteIndex":0},"citationItems":[{"id":2990,"uris":["http://zotero.org/users/6933183/items/JWN6F86P"],"itemData":{"id":2990,"type":"article-journal","abstract":"We present an Agent Based-Stock Flow Consistent Multi-Country model of a Monetary Union to analyze the impact of a change in the ﬁscal regime of member countries, modeled as a permanent change in the deﬁcit-to-gross domestic product (GDP) target that governments are committed to comply. Simulations are performed under three scenarios, differentiated by the number of countries considered (2, 6, 10). The parametric conﬁguration employed yields economically reasonable values for the dynamics and relative dimension of key variables, broadly comparable with historical data and available stylized facts. Our policy experiments show that ﬁscal expansions generally allow to improve the dynamics of real GDP, labor productivity, and employment, though being generally associated with higher levels of public debt. Conversely, permanent ﬁscal contractions always exert strong recessionary effects, exacerbate real GDP volatility, and tend to be self-defeating in the long run. In scenarios where the Monetary Union includes a greater number of countries and the common market is bigger, ﬁscal austerity raises—rather than decreasing—average public debt-to-GDP ratios. We show that this is mainly related to a raise of debt-toGDP in poorer and less productive countries mirrored by a reduction of their net foreign asset position.","container-title":"Industrial and Corporate Change","DOI":"10.1093/icc/dty016","ISSN":"0960-6491, 1464-3650","language":"en","source":"DOI.org (Crossref)","title":"The effects of fiscal targets in a monetary union: a Multi-Country Agent-Based Stock Flow Consistent model","title-short":"The effects of fiscal targets in a monetary union","URL":"https://academic.oup.com/icc/advance-article/doi/10.1093/icc/dty016/4964718","author":[{"family":"Caiani","given":"Alessandro"},{"family":"Catullo","given":"Ermanno"},{"family":"Gallegati","given":"Mauro"}],"accessed":{"date-parts":[["2021",5,8]]},"issued":{"date-parts":[["2018",4,7]]}},"suppress-author":true}],"schema":"https://github.com/citation-style-language/schema/raw/master/csl-citation.json"} </w:instrText>
+      </w:r>
+      <w:r>
+        <w:rPr>
+          <w:lang w:val="en-US"/>
+        </w:rPr>
+        <w:fldChar w:fldCharType="separate"/>
+      </w:r>
+      <w:r>
+        <w:rPr>
+          <w:rFonts w:cs="Times New Roman"/>
+          <w:lang w:val="en-US"/>
+        </w:rPr>
+        <w:t>(2018)</w:t>
+      </w:r>
+      <w:r>
+        <w:rPr>
+          <w:lang w:val="en-US"/>
+        </w:rPr>
+        <w:fldChar w:fldCharType="end"/>
+      </w:r>
+      <w:r>
+        <w:rPr>
+          <w:lang w:val="en-US"/>
+        </w:rPr>
+        <w:t>, while adopting a modular and test-driven engineering approach based on the MASQ metamodel</w:t>
+      </w:r>
+      <w:r>
+        <w:rPr>
+          <w:lang w:val="en-US"/>
+        </w:rPr>
+        <w:t xml:space="preserve"> </w:t>
+      </w:r>
+      <w:r>
+        <w:rPr>
+          <w:lang w:val="en-US"/>
+        </w:rPr>
+        <w:t>.</w:t>
+      </w:r>
+      <w:commentRangeStart w:id="0"/>
+      <w:r>
+        <w:rPr>
+          <w:lang w:val="en-US"/>
+        </w:rPr>
+        <w:t>Th</w:t>
+      </w:r>
+      <w:r>
+        <w:rPr>
+          <w:lang w:val="en-US"/>
+        </w:rPr>
+        <w:t>is</w:t>
+      </w:r>
+      <w:r>
+        <w:rPr>
+          <w:lang w:val="en-US"/>
+        </w:rPr>
+        <w:t xml:space="preserve"> replication aims to provide a reproducible, and </w:t>
+      </w:r>
+      <w:r>
+        <w:rPr>
+          <w:color w:val="FF0000"/>
+          <w:lang w:val="en-US"/>
+        </w:rPr>
+        <w:t xml:space="preserve">extensible implementation </w:t>
+      </w:r>
+      <w:r>
+        <w:rPr>
+          <w:lang w:val="en-US"/>
+        </w:rPr>
+        <w:t>of the model while maintaining consistency with its original theoretical framework.</w:t>
+      </w:r>
+      <w:commentRangeEnd w:id="0"/>
+      <w:r>
+        <w:rPr>
+          <w:rStyle w:val="Marquedecommentaire"/>
+        </w:rPr>
+        <w:commentReference w:id="0"/>
+      </w:r>
+    </w:p>
+    <w:p>
+      <w:pPr>
+        <w:pStyle w:val="Titre2"/>
+      </w:pPr>
+      <w:r>
+        <w:t>Patterns</w:t>
+      </w:r>
+    </w:p>
+    <w:p>
+      <w:pPr>
+        <w:rPr>
+          <w:lang w:val="en-US"/>
+        </w:rPr>
+      </w:pPr>
+      <w:commentRangeStart w:id="1"/>
+      <w:r>
+        <w:rPr>
+          <w:lang w:val="en-US"/>
+        </w:rPr>
+        <w:t>The model aims to r</w:t>
+      </w:r>
+      <w:r>
+        <w:rPr>
+          <w:lang w:val="en-US"/>
+        </w:rPr>
+        <w:t xml:space="preserve">eproduce realistic and stable dynamics of the </w:t>
+      </w:r>
+      <w:proofErr w:type="spellStart"/>
+      <w:r>
+        <w:rPr>
+          <w:lang w:val="en-US"/>
+        </w:rPr>
+        <w:t>foolowing</w:t>
+      </w:r>
+      <w:proofErr w:type="spellEnd"/>
+      <w:r>
+        <w:rPr>
+          <w:lang w:val="en-US"/>
+        </w:rPr>
+        <w:t xml:space="preserve"> key economic variables:</w:t>
+      </w:r>
+    </w:p>
+    <w:p>
+      <w:pPr>
+        <w:pStyle w:val="Paragraphedeliste"/>
+        <w:numPr>
+          <w:ilvl w:val="0"/>
+          <w:numId w:val="19"/>
+        </w:numPr>
+        <w:rPr>
+          <w:lang w:val="en-US"/>
+        </w:rPr>
+      </w:pPr>
+      <w:r>
+        <w:rPr>
+          <w:lang w:val="en-US"/>
+        </w:rPr>
+        <w:t xml:space="preserve"> GDP</w:t>
+      </w:r>
+      <w:r>
+        <w:rPr>
+          <w:lang w:val="en-US"/>
+        </w:rPr>
+        <w:t xml:space="preserve"> growth</w:t>
+      </w:r>
+      <w:r>
+        <w:rPr>
+          <w:lang w:val="en-US"/>
+        </w:rPr>
+        <w:t xml:space="preserve">, </w:t>
+      </w:r>
+      <w:r>
+        <w:rPr>
+          <w:lang w:val="en-US"/>
+        </w:rPr>
+        <w:t>i</w:t>
+      </w:r>
+      <w:r>
+        <w:rPr>
+          <w:lang w:val="en-US"/>
+        </w:rPr>
+        <w:t>nflation</w:t>
+      </w:r>
+      <w:r>
+        <w:rPr>
+          <w:lang w:val="en-US"/>
+        </w:rPr>
+        <w:t xml:space="preserve"> and unemployment</w:t>
+      </w:r>
+    </w:p>
+    <w:p>
+      <w:pPr>
+        <w:pStyle w:val="Paragraphedeliste"/>
+        <w:numPr>
+          <w:ilvl w:val="0"/>
+          <w:numId w:val="19"/>
+        </w:numPr>
+        <w:rPr>
+          <w:lang w:val="en-US"/>
+        </w:rPr>
+      </w:pPr>
+      <w:r>
+        <w:rPr>
+          <w:lang w:val="en-US"/>
+        </w:rPr>
+        <w:t>Imports and Exports</w:t>
+      </w:r>
+    </w:p>
+    <w:p>
+      <w:pPr>
+        <w:pStyle w:val="Paragraphedeliste"/>
+        <w:numPr>
+          <w:ilvl w:val="0"/>
+          <w:numId w:val="19"/>
+        </w:numPr>
+        <w:rPr>
+          <w:lang w:val="en-US"/>
+        </w:rPr>
+      </w:pPr>
+      <w:r>
+        <w:rPr>
+          <w:lang w:val="en-US"/>
+        </w:rPr>
+        <w:t>Productivity growth and R7D investment</w:t>
+      </w:r>
+    </w:p>
+    <w:p>
+      <w:pPr>
+        <w:pStyle w:val="Paragraphedeliste"/>
+        <w:numPr>
+          <w:ilvl w:val="0"/>
+          <w:numId w:val="19"/>
+        </w:numPr>
+        <w:rPr>
+          <w:lang w:val="en-US"/>
+        </w:rPr>
+      </w:pPr>
+      <w:r>
+        <w:rPr>
+          <w:lang w:val="en-US"/>
+        </w:rPr>
+        <w:t>Public debt, deficit and expenditures ratios</w:t>
+      </w:r>
+    </w:p>
+    <w:p>
+      <w:pPr>
+        <w:pStyle w:val="Paragraphedeliste"/>
+        <w:numPr>
+          <w:ilvl w:val="0"/>
+          <w:numId w:val="19"/>
+        </w:numPr>
+        <w:rPr>
+          <w:lang w:val="en-US"/>
+        </w:rPr>
+      </w:pPr>
+      <w:r>
+        <w:rPr>
+          <w:lang w:val="en-US"/>
+        </w:rPr>
+        <w:t>Household investments</w:t>
+      </w:r>
+      <w:commentRangeEnd w:id="1"/>
+      <w:r>
+        <w:rPr>
+          <w:rStyle w:val="Marquedecommentaire"/>
+        </w:rPr>
+        <w:commentReference w:id="1"/>
       </w:r>
     </w:p>
     <w:p>
@@ -219,86 +661,86 @@
         <w:pStyle w:val="Titre2"/>
       </w:pPr>
       <w:r>
+        <w:t>Prediction</w:t>
+      </w:r>
+    </w:p>
+    <w:p>
+      <w:pPr>
+        <w:pStyle w:val="Titre2"/>
+      </w:pPr>
+      <w:r>
+        <w:t>Sensing</w:t>
+      </w:r>
+    </w:p>
+    <w:p>
+      <w:pPr>
+        <w:pStyle w:val="Titre2"/>
+      </w:pPr>
+      <w:r>
+        <w:t>Interactio</w:t>
+      </w:r>
+      <w:r>
+        <w:t>n</w:t>
+      </w:r>
+    </w:p>
+    <w:p>
+      <w:pPr>
+        <w:pStyle w:val="Titre2"/>
+      </w:pPr>
+      <w:r>
+        <w:t>Stochasticity</w:t>
+      </w:r>
+    </w:p>
+    <w:p>
+      <w:pPr>
+        <w:pStyle w:val="Titre2"/>
+      </w:pPr>
+      <w:r>
+        <w:t>Collectives</w:t>
+      </w:r>
+    </w:p>
+    <w:p>
+      <w:pPr>
+        <w:rPr>
+          <w:lang w:val="en-US"/>
+        </w:rPr>
+      </w:pPr>
+      <w:r>
+        <w:rPr>
+          <w:lang w:val="en-US"/>
+        </w:rPr>
+        <w:t>The model includes no collectives.</w:t>
+      </w:r>
+    </w:p>
+    <w:p>
+      <w:pPr>
+        <w:pStyle w:val="Titre2"/>
+      </w:pPr>
+      <w:r>
+        <w:t>Observation</w:t>
+      </w:r>
+    </w:p>
+    <w:p>
+      <w:pPr>
+        <w:rPr>
+          <w:lang w:val="en-US"/>
+        </w:rPr>
+      </w:pPr>
+    </w:p>
+    <w:p>
+      <w:pPr>
+        <w:rPr>
+          <w:lang w:val="en-US"/>
+        </w:rPr>
+      </w:pPr>
+    </w:p>
+    <w:p>
+      <w:pPr>
+        <w:pStyle w:val="Titre1"/>
+      </w:pPr>
+      <w:proofErr w:type="spellStart"/>
+      <w:r>
         <w:lastRenderedPageBreak/>
-        <w:t>Prediction</w:t>
-      </w:r>
-    </w:p>
-    <w:p>
-      <w:pPr>
-        <w:pStyle w:val="Titre2"/>
-      </w:pPr>
-      <w:r>
-        <w:t>Sensing</w:t>
-      </w:r>
-    </w:p>
-    <w:p>
-      <w:pPr>
-        <w:pStyle w:val="Titre2"/>
-      </w:pPr>
-      <w:r>
-        <w:t>Interactio</w:t>
-      </w:r>
-      <w:r>
-        <w:t>n</w:t>
-      </w:r>
-    </w:p>
-    <w:p>
-      <w:pPr>
-        <w:pStyle w:val="Titre2"/>
-      </w:pPr>
-      <w:r>
-        <w:t>Stochasticity</w:t>
-      </w:r>
-    </w:p>
-    <w:p>
-      <w:pPr>
-        <w:pStyle w:val="Titre2"/>
-      </w:pPr>
-      <w:r>
-        <w:t>Collectives</w:t>
-      </w:r>
-    </w:p>
-    <w:p>
-      <w:pPr>
-        <w:rPr>
-          <w:lang w:val="en-US"/>
-        </w:rPr>
-      </w:pPr>
-      <w:r>
-        <w:rPr>
-          <w:lang w:val="en-US"/>
-        </w:rPr>
-        <w:t>The model includes no collectives.</w:t>
-      </w:r>
-    </w:p>
-    <w:p>
-      <w:pPr>
-        <w:pStyle w:val="Titre2"/>
-      </w:pPr>
-      <w:r>
-        <w:t>Observation</w:t>
-      </w:r>
-    </w:p>
-    <w:p>
-      <w:pPr>
-        <w:rPr>
-          <w:lang w:val="en-US"/>
-        </w:rPr>
-      </w:pPr>
-    </w:p>
-    <w:p>
-      <w:pPr>
-        <w:rPr>
-          <w:lang w:val="en-US"/>
-        </w:rPr>
-      </w:pPr>
-    </w:p>
-    <w:p>
-      <w:pPr>
-        <w:pStyle w:val="Titre1"/>
-      </w:pPr>
-      <w:proofErr w:type="spellStart"/>
-      <w:r>
         <w:t>Initialization</w:t>
       </w:r>
       <w:proofErr w:type="spellEnd"/>
@@ -386,6 +828,64 @@
 </w:document>
 </file>
 
+<file path=word/comments.xml><?xml version="1.0" encoding="utf-8"?>
+<w:comments xmlns:wpc="http://schemas.microsoft.com/office/word/2010/wordprocessingCanvas" xmlns:cx="http://schemas.microsoft.com/office/drawing/2014/chartex" xmlns:cx1="http://schemas.microsoft.com/office/drawing/2015/9/8/chartex" xmlns:cx2="http://schemas.microsoft.com/office/drawing/2015/10/21/chartex" xmlns:cx3="http://schemas.microsoft.com/office/drawing/2016/5/9/chartex" xmlns:cx4="http://schemas.microsoft.com/office/drawing/2016/5/10/chartex" xmlns:cx5="http://schemas.microsoft.com/office/drawing/2016/5/11/chartex" xmlns:cx6="http://schemas.microsoft.com/office/drawing/2016/5/12/chartex" xmlns:cx7="http://schemas.microsoft.com/office/drawing/2016/5/13/chartex" xmlns:cx8="http://schemas.microsoft.com/office/drawing/2016/5/14/chartex" xmlns:mc="http://schemas.openxmlformats.org/markup-compatibility/2006" xmlns:aink="http://schemas.microsoft.com/office/drawing/2016/ink" xmlns:am3d="http://schemas.microsoft.com/office/drawing/2017/model3d" xmlns:o="urn:schemas-microsoft-com:office:office" xmlns:r="http://schemas.openxmlformats.org/officeDocument/2006/relationships" xmlns:m="http://schemas.openxmlformats.org/officeDocument/2006/math" xmlns:v="urn:schemas-microsoft-com:vml" xmlns:wp14="http://schemas.microsoft.com/office/word/2010/wordprocessingDrawing" xmlns:wp="http://schemas.openxmlformats.org/drawingml/2006/wordprocessingDrawing" xmlns:w10="urn:schemas-microsoft-com:office:word" xmlns:w="http://schemas.openxmlformats.org/wordprocessingml/2006/main" xmlns:w14="http://schemas.microsoft.com/office/word/2010/wordml" xmlns:w15="http://schemas.microsoft.com/office/word/2012/wordml" xmlns:w16cex="http://schemas.microsoft.com/office/word/2018/wordml/cex" xmlns:w16cid="http://schemas.microsoft.com/office/word/2016/wordml/cid" xmlns:w16="http://schemas.microsoft.com/office/word/2018/wordml" xmlns:w16sdtdh="http://schemas.microsoft.com/office/word/2020/wordml/sdtdatahash" xmlns:w16se="http://schemas.microsoft.com/office/word/2015/wordml/symex" xmlns:wpg="http://schemas.microsoft.com/office/word/2010/wordprocessingGroup" xmlns:wpi="http://schemas.microsoft.com/office/word/2010/wordprocessingInk" xmlns:wne="http://schemas.microsoft.com/office/word/2006/wordml" xmlns:wps="http://schemas.microsoft.com/office/word/2010/wordprocessingShape" mc:Ignorable="w14 w15 w16se w16cid w16 w16cex w16sdtdh wp14">
+  <w:comment w:id="0" w:author="MalcomDev" w:date="2026-08-31T05:20:00Z" w:initials="M">
+    <w:p>
+      <w:pPr>
+        <w:pStyle w:val="Commentaire"/>
+      </w:pPr>
+      <w:r>
+        <w:rPr>
+          <w:rStyle w:val="Marquedecommentaire"/>
+        </w:rPr>
+        <w:annotationRef/>
+      </w:r>
+      <w:r>
+        <w:t>Revoir cette formulation</w:t>
+      </w:r>
+    </w:p>
+  </w:comment>
+  <w:comment w:id="1" w:author="MalcomDev" w:date="2026-08-31T05:33:00Z" w:initials="M">
+    <w:p>
+      <w:pPr>
+        <w:pStyle w:val="Commentaire"/>
+      </w:pPr>
+      <w:r>
+        <w:rPr>
+          <w:rStyle w:val="Marquedecommentaire"/>
+        </w:rPr>
+        <w:annotationRef/>
+      </w:r>
+      <w:r>
+        <w:t>A revoir</w:t>
+      </w:r>
+    </w:p>
+  </w:comment>
+</w:comments>
+</file>
+
+<file path=word/commentsExtended.xml><?xml version="1.0" encoding="utf-8"?>
+<w15:commentsEx xmlns:wpc="http://schemas.microsoft.com/office/word/2010/wordprocessingCanvas" xmlns:cx="http://schemas.microsoft.com/office/drawing/2014/chartex" xmlns:cx1="http://schemas.microsoft.com/office/drawing/2015/9/8/chartex" xmlns:cx2="http://schemas.microsoft.com/office/drawing/2015/10/21/chartex" xmlns:cx3="http://schemas.microsoft.com/office/drawing/2016/5/9/chartex" xmlns:cx4="http://schemas.microsoft.com/office/drawing/2016/5/10/chartex" xmlns:cx5="http://schemas.microsoft.com/office/drawing/2016/5/11/chartex" xmlns:cx6="http://schemas.microsoft.com/office/drawing/2016/5/12/chartex" xmlns:cx7="http://schemas.microsoft.com/office/drawing/2016/5/13/chartex" xmlns:cx8="http://schemas.microsoft.com/office/drawing/2016/5/14/chartex" xmlns:mc="http://schemas.openxmlformats.org/markup-compatibility/2006" xmlns:aink="http://schemas.microsoft.com/office/drawing/2016/ink" xmlns:am3d="http://schemas.microsoft.com/office/drawing/2017/model3d" xmlns:o="urn:schemas-microsoft-com:office:office" xmlns:r="http://schemas.openxmlformats.org/officeDocument/2006/relationships" xmlns:m="http://schemas.openxmlformats.org/officeDocument/2006/math" xmlns:v="urn:schemas-microsoft-com:vml" xmlns:wp14="http://schemas.microsoft.com/office/word/2010/wordprocessingDrawing" xmlns:wp="http://schemas.openxmlformats.org/drawingml/2006/wordprocessingDrawing" xmlns:w10="urn:schemas-microsoft-com:office:word" xmlns:w="http://schemas.openxmlformats.org/wordprocessingml/2006/main" xmlns:w14="http://schemas.microsoft.com/office/word/2010/wordml" xmlns:w15="http://schemas.microsoft.com/office/word/2012/wordml" xmlns:w16cex="http://schemas.microsoft.com/office/word/2018/wordml/cex" xmlns:w16cid="http://schemas.microsoft.com/office/word/2016/wordml/cid" xmlns:w16="http://schemas.microsoft.com/office/word/2018/wordml" xmlns:w16sdtdh="http://schemas.microsoft.com/office/word/2020/wordml/sdtdatahash" xmlns:w16se="http://schemas.microsoft.com/office/word/2015/wordml/symex" xmlns:wpg="http://schemas.microsoft.com/office/word/2010/wordprocessingGroup" xmlns:wpi="http://schemas.microsoft.com/office/word/2010/wordprocessingInk" xmlns:wne="http://schemas.microsoft.com/office/word/2006/wordml" xmlns:wps="http://schemas.microsoft.com/office/word/2010/wordprocessingShape" mc:Ignorable="w14 w15 w16se w16cid w16 w16cex w16sdtdh wp14">
+  <w15:commentEx w15:paraId="71C3DFBE" w15:done="0"/>
+  <w15:commentEx w15:paraId="166EFE25" w15:done="0"/>
+</w15:commentsEx>
+</file>
+
+<file path=word/commentsExtensible.xml><?xml version="1.0" encoding="utf-8"?>
+<w16cex:commentsExtensible xmlns:wpc="http://schemas.microsoft.com/office/word/2010/wordprocessingCanvas" xmlns:cx="http://schemas.microsoft.com/office/drawing/2014/chartex" xmlns:cx1="http://schemas.microsoft.com/office/drawing/2015/9/8/chartex" xmlns:cx2="http://schemas.microsoft.com/office/drawing/2015/10/21/chartex" xmlns:cx3="http://schemas.microsoft.com/office/drawing/2016/5/9/chartex" xmlns:cx4="http://schemas.microsoft.com/office/drawing/2016/5/10/chartex" xmlns:cx5="http://schemas.microsoft.com/office/drawing/2016/5/11/chartex" xmlns:cx6="http://schemas.microsoft.com/office/drawing/2016/5/12/chartex" xmlns:cx7="http://schemas.microsoft.com/office/drawing/2016/5/13/chartex" xmlns:cx8="http://schemas.microsoft.com/office/drawing/2016/5/14/chartex" xmlns:mc="http://schemas.openxmlformats.org/markup-compatibility/2006" xmlns:aink="http://schemas.microsoft.com/office/drawing/2016/ink" xmlns:am3d="http://schemas.microsoft.com/office/drawing/2017/model3d" xmlns:o="urn:schemas-microsoft-com:office:office" xmlns:r="http://schemas.openxmlformats.org/officeDocument/2006/relationships" xmlns:m="http://schemas.openxmlformats.org/officeDocument/2006/math" xmlns:v="urn:schemas-microsoft-com:vml" xmlns:wp14="http://schemas.microsoft.com/office/word/2010/wordprocessingDrawing" xmlns:wp="http://schemas.openxmlformats.org/drawingml/2006/wordprocessingDrawing" xmlns:w10="urn:schemas-microsoft-com:office:word" xmlns:w="http://schemas.openxmlformats.org/wordprocessingml/2006/main" xmlns:w14="http://schemas.microsoft.com/office/word/2010/wordml" xmlns:w15="http://schemas.microsoft.com/office/word/2012/wordml" xmlns:w16cex="http://schemas.microsoft.com/office/word/2018/wordml/cex" xmlns:w16cid="http://schemas.microsoft.com/office/word/2016/wordml/cid" xmlns:w16="http://schemas.microsoft.com/office/word/2018/wordml" xmlns:w16sdtdh="http://schemas.microsoft.com/office/word/2020/wordml/sdtdatahash" xmlns:w16se="http://schemas.microsoft.com/office/word/2015/wordml/symex" xmlns:wpg="http://schemas.microsoft.com/office/word/2010/wordprocessingGroup" xmlns:wpi="http://schemas.microsoft.com/office/word/2010/wordprocessingInk" xmlns:wne="http://schemas.microsoft.com/office/word/2006/wordml" xmlns:wps="http://schemas.microsoft.com/office/word/2010/wordprocessingShape" mc:Ignorable="w14 w15 w16se w16cid w16 w16cex w16sdtdh wp14">
+  <w16cex:commentExtensible w16cex:durableId="2E3F8DA0" w16cex:dateUtc="2026-08-31T04:20:00Z"/>
+  <w16cex:commentExtensible w16cex:durableId="2E3F90A4" w16cex:dateUtc="2026-08-31T04:33:00Z"/>
+</w16cex:commentsExtensible>
+</file>
+
+<file path=word/commentsIds.xml><?xml version="1.0" encoding="utf-8"?>
+<w16cid:commentsIds xmlns:wpc="http://schemas.microsoft.com/office/word/2010/wordprocessingCanvas" xmlns:cx="http://schemas.microsoft.com/office/drawing/2014/chartex" xmlns:cx1="http://schemas.microsoft.com/office/drawing/2015/9/8/chartex" xmlns:cx2="http://schemas.microsoft.com/office/drawing/2015/10/21/chartex" xmlns:cx3="http://schemas.microsoft.com/office/drawing/2016/5/9/chartex" xmlns:cx4="http://schemas.microsoft.com/office/drawing/2016/5/10/chartex" xmlns:cx5="http://schemas.microsoft.com/office/drawing/2016/5/11/chartex" xmlns:cx6="http://schemas.microsoft.com/office/drawing/2016/5/12/chartex" xmlns:cx7="http://schemas.microsoft.com/office/drawing/2016/5/13/chartex" xmlns:cx8="http://schemas.microsoft.com/office/drawing/2016/5/14/chartex" xmlns:mc="http://schemas.openxmlformats.org/markup-compatibility/2006" xmlns:aink="http://schemas.microsoft.com/office/drawing/2016/ink" xmlns:am3d="http://schemas.microsoft.com/office/drawing/2017/model3d" xmlns:o="urn:schemas-microsoft-com:office:office" xmlns:r="http://schemas.openxmlformats.org/officeDocument/2006/relationships" xmlns:m="http://schemas.openxmlformats.org/officeDocument/2006/math" xmlns:v="urn:schemas-microsoft-com:vml" xmlns:wp14="http://schemas.microsoft.com/office/word/2010/wordprocessingDrawing" xmlns:wp="http://schemas.openxmlformats.org/drawingml/2006/wordprocessingDrawing" xmlns:w10="urn:schemas-microsoft-com:office:word" xmlns:w="http://schemas.openxmlformats.org/wordprocessingml/2006/main" xmlns:w14="http://schemas.microsoft.com/office/word/2010/wordml" xmlns:w15="http://schemas.microsoft.com/office/word/2012/wordml" xmlns:w16cex="http://schemas.microsoft.com/office/word/2018/wordml/cex" xmlns:w16cid="http://schemas.microsoft.com/office/word/2016/wordml/cid" xmlns:w16="http://schemas.microsoft.com/office/word/2018/wordml" xmlns:w16sdtdh="http://schemas.microsoft.com/office/word/2020/wordml/sdtdatahash" xmlns:w16se="http://schemas.microsoft.com/office/word/2015/wordml/symex" xmlns:wpg="http://schemas.microsoft.com/office/word/2010/wordprocessingGroup" xmlns:wpi="http://schemas.microsoft.com/office/word/2010/wordprocessingInk" xmlns:wne="http://schemas.microsoft.com/office/word/2006/wordml" xmlns:wps="http://schemas.microsoft.com/office/word/2010/wordprocessingShape" mc:Ignorable="w14 w15 w16se w16cid w16 w16cex w16sdtdh wp14">
+  <w16cid:commentId w16cid:paraId="71C3DFBE" w16cid:durableId="2E3F8DA0"/>
+  <w16cid:commentId w16cid:paraId="166EFE25" w16cid:durableId="2E3F90A4"/>
+</w16cid:commentsIds>
+</file>
+
 <file path=word/numbering.xml><?xml version="1.0" encoding="utf-8"?>
 <w:numbering xmlns:wpc="http://schemas.microsoft.com/office/word/2010/wordprocessingCanvas" xmlns:cx="http://schemas.microsoft.com/office/drawing/2014/chartex" xmlns:cx1="http://schemas.microsoft.com/office/drawing/2015/9/8/chartex" xmlns:cx2="http://schemas.microsoft.com/office/drawing/2015/10/21/chartex" xmlns:cx3="http://schemas.microsoft.com/office/drawing/2016/5/9/chartex" xmlns:cx4="http://schemas.microsoft.com/office/drawing/2016/5/10/chartex" xmlns:cx5="http://schemas.microsoft.com/office/drawing/2016/5/11/chartex" xmlns:cx6="http://schemas.microsoft.com/office/drawing/2016/5/12/chartex" xmlns:cx7="http://schemas.microsoft.com/office/drawing/2016/5/13/chartex" xmlns:cx8="http://schemas.microsoft.com/office/drawing/2016/5/14/chartex" xmlns:mc="http://schemas.openxmlformats.org/markup-compatibility/2006" xmlns:aink="http://schemas.microsoft.com/office/drawing/2016/ink" xmlns:am3d="http://schemas.microsoft.com/office/drawing/2017/model3d" xmlns:o="urn:schemas-microsoft-com:office:office" xmlns:r="http://schemas.openxmlformats.org/officeDocument/2006/relationships" xmlns:m="http://schemas.openxmlformats.org/officeDocument/2006/math" xmlns:v="urn:schemas-microsoft-com:vml" xmlns:wp14="http://schemas.microsoft.com/office/word/2010/wordprocessingDrawing" xmlns:wp="http://schemas.openxmlformats.org/drawingml/2006/wordprocessingDrawing" xmlns:w10="urn:schemas-microsoft-com:office:word" xmlns:w="http://schemas.openxmlformats.org/wordprocessingml/2006/main" xmlns:w14="http://schemas.microsoft.com/office/word/2010/wordml" xmlns:w15="http://schemas.microsoft.com/office/word/2012/wordml" xmlns:w16cex="http://schemas.microsoft.com/office/word/2018/wordml/cex" xmlns:w16cid="http://schemas.microsoft.com/office/word/2016/wordml/cid" xmlns:w16="http://schemas.microsoft.com/office/word/2018/wordml" xmlns:w16sdtdh="http://schemas.microsoft.com/office/word/2020/wordml/sdtdatahash" xmlns:w16se="http://schemas.microsoft.com/office/word/2015/wordml/symex" xmlns:wpg="http://schemas.microsoft.com/office/word/2010/wordprocessingGroup" xmlns:wpi="http://schemas.microsoft.com/office/word/2010/wordprocessingInk" xmlns:wne="http://schemas.microsoft.com/office/word/2006/wordml" xmlns:wps="http://schemas.microsoft.com/office/word/2010/wordprocessingShape" mc:Ignorable="w14 w15 w16se w16cid w16 w16cex w16sdtdh wp14">
   <w:abstractNum w:abstractNumId="0" w15:restartNumberingAfterBreak="0">
@@ -1735,6 +2235,118 @@
     </w:lvl>
   </w:abstractNum>
   <w:abstractNum w:abstractNumId="13" w15:restartNumberingAfterBreak="0">
+    <w:nsid w:val="644031ED"/>
+    <w:multiLevelType w:val="hybridMultilevel"/>
+    <w:tmpl w:val="74462C18"/>
+    <w:lvl w:ilvl="0" w:tplc="3F647226">
+      <w:numFmt w:val="bullet"/>
+      <w:lvlText w:val="-"/>
+      <w:lvlJc w:val="left"/>
+      <w:pPr>
+        <w:ind w:left="720" w:hanging="360"/>
+      </w:pPr>
+      <w:rPr>
+        <w:rFonts w:ascii="Times New Roman" w:eastAsiaTheme="minorHAnsi" w:hAnsi="Times New Roman" w:cs="Times New Roman" w:hint="default"/>
+      </w:rPr>
+    </w:lvl>
+    <w:lvl w:ilvl="1" w:tplc="2C0C0003" w:tentative="1">
+      <w:start w:val="1"/>
+      <w:numFmt w:val="bullet"/>
+      <w:lvlText w:val="o"/>
+      <w:lvlJc w:val="left"/>
+      <w:pPr>
+        <w:ind w:left="1440" w:hanging="360"/>
+      </w:pPr>
+      <w:rPr>
+        <w:rFonts w:ascii="Courier New" w:hAnsi="Courier New" w:cs="Courier New" w:hint="default"/>
+      </w:rPr>
+    </w:lvl>
+    <w:lvl w:ilvl="2" w:tplc="2C0C0005" w:tentative="1">
+      <w:start w:val="1"/>
+      <w:numFmt w:val="bullet"/>
+      <w:lvlText w:val=""/>
+      <w:lvlJc w:val="left"/>
+      <w:pPr>
+        <w:ind w:left="2160" w:hanging="360"/>
+      </w:pPr>
+      <w:rPr>
+        <w:rFonts w:ascii="Wingdings" w:hAnsi="Wingdings" w:hint="default"/>
+      </w:rPr>
+    </w:lvl>
+    <w:lvl w:ilvl="3" w:tplc="2C0C0001" w:tentative="1">
+      <w:start w:val="1"/>
+      <w:numFmt w:val="bullet"/>
+      <w:lvlText w:val=""/>
+      <w:lvlJc w:val="left"/>
+      <w:pPr>
+        <w:ind w:left="2880" w:hanging="360"/>
+      </w:pPr>
+      <w:rPr>
+        <w:rFonts w:ascii="Symbol" w:hAnsi="Symbol" w:hint="default"/>
+      </w:rPr>
+    </w:lvl>
+    <w:lvl w:ilvl="4" w:tplc="2C0C0003" w:tentative="1">
+      <w:start w:val="1"/>
+      <w:numFmt w:val="bullet"/>
+      <w:lvlText w:val="o"/>
+      <w:lvlJc w:val="left"/>
+      <w:pPr>
+        <w:ind w:left="3600" w:hanging="360"/>
+      </w:pPr>
+      <w:rPr>
+        <w:rFonts w:ascii="Courier New" w:hAnsi="Courier New" w:cs="Courier New" w:hint="default"/>
+      </w:rPr>
+    </w:lvl>
+    <w:lvl w:ilvl="5" w:tplc="2C0C0005" w:tentative="1">
+      <w:start w:val="1"/>
+      <w:numFmt w:val="bullet"/>
+      <w:lvlText w:val=""/>
+      <w:lvlJc w:val="left"/>
+      <w:pPr>
+        <w:ind w:left="4320" w:hanging="360"/>
+      </w:pPr>
+      <w:rPr>
+        <w:rFonts w:ascii="Wingdings" w:hAnsi="Wingdings" w:hint="default"/>
+      </w:rPr>
+    </w:lvl>
+    <w:lvl w:ilvl="6" w:tplc="2C0C0001" w:tentative="1">
+      <w:start w:val="1"/>
+      <w:numFmt w:val="bullet"/>
+      <w:lvlText w:val=""/>
+      <w:lvlJc w:val="left"/>
+      <w:pPr>
+        <w:ind w:left="5040" w:hanging="360"/>
+      </w:pPr>
+      <w:rPr>
+        <w:rFonts w:ascii="Symbol" w:hAnsi="Symbol" w:hint="default"/>
+      </w:rPr>
+    </w:lvl>
+    <w:lvl w:ilvl="7" w:tplc="2C0C0003" w:tentative="1">
+      <w:start w:val="1"/>
+      <w:numFmt w:val="bullet"/>
+      <w:lvlText w:val="o"/>
+      <w:lvlJc w:val="left"/>
+      <w:pPr>
+        <w:ind w:left="5760" w:hanging="360"/>
+      </w:pPr>
+      <w:rPr>
+        <w:rFonts w:ascii="Courier New" w:hAnsi="Courier New" w:cs="Courier New" w:hint="default"/>
+      </w:rPr>
+    </w:lvl>
+    <w:lvl w:ilvl="8" w:tplc="2C0C0005" w:tentative="1">
+      <w:start w:val="1"/>
+      <w:numFmt w:val="bullet"/>
+      <w:lvlText w:val=""/>
+      <w:lvlJc w:val="left"/>
+      <w:pPr>
+        <w:ind w:left="6480" w:hanging="360"/>
+      </w:pPr>
+      <w:rPr>
+        <w:rFonts w:ascii="Wingdings" w:hAnsi="Wingdings" w:hint="default"/>
+      </w:rPr>
+    </w:lvl>
+  </w:abstractNum>
+  <w:abstractNum w:abstractNumId="14" w15:restartNumberingAfterBreak="0">
     <w:nsid w:val="68AE2AF1"/>
     <w:multiLevelType w:val="hybridMultilevel"/>
     <w:tmpl w:val="1AD83F96"/>
@@ -1847,7 +2459,7 @@
       </w:rPr>
     </w:lvl>
   </w:abstractNum>
-  <w:abstractNum w:abstractNumId="14" w15:restartNumberingAfterBreak="0">
+  <w:abstractNum w:abstractNumId="15" w15:restartNumberingAfterBreak="0">
     <w:nsid w:val="6BDA5B74"/>
     <w:multiLevelType w:val="hybridMultilevel"/>
     <w:tmpl w:val="988CE32A"/>
@@ -1960,7 +2572,7 @@
       </w:rPr>
     </w:lvl>
   </w:abstractNum>
-  <w:abstractNum w:abstractNumId="15" w15:restartNumberingAfterBreak="0">
+  <w:abstractNum w:abstractNumId="16" w15:restartNumberingAfterBreak="0">
     <w:nsid w:val="6CC5192D"/>
     <w:multiLevelType w:val="hybridMultilevel"/>
     <w:tmpl w:val="1AF2F46C"/>
@@ -2072,7 +2684,7 @@
       </w:rPr>
     </w:lvl>
   </w:abstractNum>
-  <w:abstractNum w:abstractNumId="16" w15:restartNumberingAfterBreak="0">
+  <w:abstractNum w:abstractNumId="17" w15:restartNumberingAfterBreak="0">
     <w:nsid w:val="6EBA1781"/>
     <w:multiLevelType w:val="hybridMultilevel"/>
     <w:tmpl w:val="753E6F6A"/>
@@ -2204,7 +2816,7 @@
     <w:abstractNumId w:val="8"/>
   </w:num>
   <w:num w:numId="7">
-    <w:abstractNumId w:val="14"/>
+    <w:abstractNumId w:val="15"/>
   </w:num>
   <w:num w:numId="8">
     <w:abstractNumId w:val="0"/>
@@ -2216,13 +2828,13 @@
     <w:abstractNumId w:val="11"/>
   </w:num>
   <w:num w:numId="11">
-    <w:abstractNumId w:val="13"/>
+    <w:abstractNumId w:val="14"/>
   </w:num>
   <w:num w:numId="12">
     <w:abstractNumId w:val="10"/>
   </w:num>
   <w:num w:numId="13">
-    <w:abstractNumId w:val="16"/>
+    <w:abstractNumId w:val="17"/>
   </w:num>
   <w:num w:numId="14">
     <w:abstractNumId w:val="12"/>
@@ -2237,9 +2849,20 @@
     <w:abstractNumId w:val="5"/>
   </w:num>
   <w:num w:numId="18">
-    <w:abstractNumId w:val="15"/>
+    <w:abstractNumId w:val="16"/>
+  </w:num>
+  <w:num w:numId="19">
+    <w:abstractNumId w:val="13"/>
   </w:num>
 </w:numbering>
+</file>
+
+<file path=word/people.xml><?xml version="1.0" encoding="utf-8"?>
+<w15:people xmlns:wpc="http://schemas.microsoft.com/office/word/2010/wordprocessingCanvas" xmlns:cx="http://schemas.microsoft.com/office/drawing/2014/chartex" xmlns:cx1="http://schemas.microsoft.com/office/drawing/2015/9/8/chartex" xmlns:cx2="http://schemas.microsoft.com/office/drawing/2015/10/21/chartex" xmlns:cx3="http://schemas.microsoft.com/office/drawing/2016/5/9/chartex" xmlns:cx4="http://schemas.microsoft.com/office/drawing/2016/5/10/chartex" xmlns:cx5="http://schemas.microsoft.com/office/drawing/2016/5/11/chartex" xmlns:cx6="http://schemas.microsoft.com/office/drawing/2016/5/12/chartex" xmlns:cx7="http://schemas.microsoft.com/office/drawing/2016/5/13/chartex" xmlns:cx8="http://schemas.microsoft.com/office/drawing/2016/5/14/chartex" xmlns:mc="http://schemas.openxmlformats.org/markup-compatibility/2006" xmlns:aink="http://schemas.microsoft.com/office/drawing/2016/ink" xmlns:am3d="http://schemas.microsoft.com/office/drawing/2017/model3d" xmlns:o="urn:schemas-microsoft-com:office:office" xmlns:r="http://schemas.openxmlformats.org/officeDocument/2006/relationships" xmlns:m="http://schemas.openxmlformats.org/officeDocument/2006/math" xmlns:v="urn:schemas-microsoft-com:vml" xmlns:wp14="http://schemas.microsoft.com/office/word/2010/wordprocessingDrawing" xmlns:wp="http://schemas.openxmlformats.org/drawingml/2006/wordprocessingDrawing" xmlns:w10="urn:schemas-microsoft-com:office:word" xmlns:w="http://schemas.openxmlformats.org/wordprocessingml/2006/main" xmlns:w14="http://schemas.microsoft.com/office/word/2010/wordml" xmlns:w15="http://schemas.microsoft.com/office/word/2012/wordml" xmlns:w16cex="http://schemas.microsoft.com/office/word/2018/wordml/cex" xmlns:w16cid="http://schemas.microsoft.com/office/word/2016/wordml/cid" xmlns:w16="http://schemas.microsoft.com/office/word/2018/wordml" xmlns:w16sdtdh="http://schemas.microsoft.com/office/word/2020/wordml/sdtdatahash" xmlns:w16se="http://schemas.microsoft.com/office/word/2015/wordml/symex" xmlns:wpg="http://schemas.microsoft.com/office/word/2010/wordprocessingGroup" xmlns:wpi="http://schemas.microsoft.com/office/word/2010/wordprocessingInk" xmlns:wne="http://schemas.microsoft.com/office/word/2006/wordml" xmlns:wps="http://schemas.microsoft.com/office/word/2010/wordprocessingShape" mc:Ignorable="w14 w15 w16se w16cid w16 w16cex w16sdtdh wp14">
+  <w15:person w15:author="MalcomDev">
+    <w15:presenceInfo w15:providerId="None" w15:userId="MalcomDev"/>
+  </w15:person>
+</w15:people>
 </file>
 
 <file path=word/styles.xml><?xml version="1.0" encoding="utf-8"?>
@@ -2889,7 +3512,6 @@
   <w:style w:type="character" w:default="1" w:styleId="Policepardfaut">
     <w:name w:val="Default Paragraph Font"/>
     <w:uiPriority w:val="1"/>
-    <w:semiHidden/>
     <w:unhideWhenUsed/>
   </w:style>
   <w:style w:type="table" w:default="1" w:styleId="TableauNormal">

</xml_diff>